<commit_message>
Phase 1: Ergebnis des Tenant-Checks eingearbeitet
- Test-TenantReadiness: RMS-Vorlagen mit GUID ausgeben und lokalisierte
  Namen (Encrypt = Verschlüsseln) erkennen; SPO-Modul unter PowerShell 7
  mit vollem Pfad importieren.
- Testkonten und Doku an die geprüften Gruppen angepasst: Debra Berger ist
  nur im Finance Team, MOD Administrator in allen drei Gruppen.
- Anleitung: falsche Angabe zu 'Confidential \ All Employees' korrigiert.

Co-Authored-By: Claude Opus 5.5 <noreply@anthropic.com>
Claude-Session: https://claude.ai/code/session_01B9kfFEfvigtmrSNC6uJaHV
</commit_message>
<xml_diff>
--- a/Demo Dokumente/Demo-Runbook-Purview-UseCases.docx
+++ b/Demo Dokumente/Demo-Runbook-Purview-UseCases.docx
@@ -341,7 +341,7 @@
                 <w:sz w:val="19"/>
                 <w:szCs w:val="19"/>
               </w:rPr>
-              <w:t xml:space="preserve">Finance Team, Leadership</w:t>
+              <w:t xml:space="preserve">Finance Team</w:t>
             </w:r>
           </w:p>
         </w:tc>
@@ -2195,7 +2195,7 @@
                 <w:sz w:val="19"/>
                 <w:szCs w:val="19"/>
               </w:rPr>
-              <w:t xml:space="preserve">Finance Team, Leadership</w:t>
+              <w:t xml:space="preserve">Finance Team</w:t>
             </w:r>
           </w:p>
         </w:tc>
@@ -2559,7 +2559,7 @@
                 <w:sz w:val="19"/>
                 <w:szCs w:val="19"/>
               </w:rPr>
-              <w:t xml:space="preserve">Finance Team, Leadership</w:t>
+              <w:t xml:space="preserve">Finance Team</w:t>
             </w:r>
           </w:p>
         </w:tc>
@@ -2969,7 +2969,7 @@
         <w:spacing w:after="60"/>
       </w:pPr>
       <w:r>
-        <w:t>Als Pradeep Gupta (Finance, nicht Leadership) öffnen versuchen. Nicht Debra Berger verwenden: sie ist Mitglied von Leadership und hat Co-Author-Rechte.</w:t>
+        <w:t>Als Pradeep Gupta (Finance, nicht Leadership) öffnen versuchen. Debra Berger ist ebenfalls nur im Finance Team und eignet sich genauso. Nicht Megan Bowen oder Lynne Robbins verwenden: sie sind Mitglied von Leadership und haben Co-Author-Rechte.</w:t>
       </w:r>
     </w:p>
     <w:p>

</xml_diff>